<commit_message>
Student Partner: EXCLUSION EXPRESA de practicas/pasantias/contratos de aprendizaje (cargas legales propias: afiliaciones, cuota de aprendices, reforma laboral) — solo egresados para vacantes ordinarias; la palabra practicante no se usa en reuniones
Co-Authored-By: Claude Fable 5 <noreply@anthropic.com>
Claude-Session: https://claude.ai/code/session_018H7C5dx3NvDfXiv3CfhPMa
</commit_message>
<xml_diff>
--- a/recursos/comercial/B2B/CONDICIONES_GO_ABOVE_AND_BEYOND.docx
+++ b/recursos/comercial/B2B/CONDICIONES_GO_ABOVE_AND_BEYOND.docx
@@ -160,6 +160,18 @@
           <w:sz w:val="22"/>
         </w:rPr>
         <w:t>· A los estudiantes JAMÁS se les promete empleo: la vitrina se comunica como una puerta que se abre al que se destaca — nunca como garantía.</w:t>
+      </w:r>
+    </w:p>
+    <w:p>
+      <w:pPr>
+        <w:spacing w:after="80"/>
+      </w:pPr>
+      <w:r>
+        <w:rPr>
+          <w:b/>
+          <w:sz w:val="22"/>
+        </w:rPr>
+        <w:t>· EXCLUSIÓN EXPRESA: el programa NO gestiona prácticas, pasantías ni contratos de aprendizaje — presenta EGRESADOS para vacantes ordinarias. Las figuras de práctica/aprendizaje tienen cargas legales propias (afiliaciones, cuota de aprendices, reforma laboral) y NO hacen parte de este programa. La palabra practicante no se usa en ninguna reunión.</w:t>
       </w:r>
     </w:p>
     <w:p>

</xml_diff>

<commit_message>
School Partner (carta v1 + condiciones: Experience Class, Premio Heiiu en ceremonia de grado, charla padres, convenio egresados — canal para cohorte ENERO) + cartas firmadas por GERENCIA (sin officer) + BORRADOR contrato docente-alianzas v3 (vigencia 1 ano por actas, objeto dual, cesion de obra, remuneracion alianzas por definir, sin facultad de representacion; base v2 firmado; pendiente VoBo abogado) + contrato JD firmado archivado en contratos/
Co-Authored-By: Claude Fable 5 <noreply@anthropic.com>
Claude-Session: https://claude.ai/code/session_018H7C5dx3NvDfXiv3CfhPMa
</commit_message>
<xml_diff>
--- a/recursos/comercial/B2B/CONDICIONES_GO_ABOVE_AND_BEYOND.docx
+++ b/recursos/comercial/B2B/CONDICIONES_GO_ABOVE_AND_BEYOND.docx
@@ -184,6 +184,79 @@
           <w:color w:val="E54C09"/>
           <w:sz w:val="27"/>
         </w:rPr>
+        <w:t>3. HEIIU SCHOOL PARTNER (colegios — grado 11)</w:t>
+      </w:r>
+    </w:p>
+    <w:p>
+      <w:pPr>
+        <w:spacing w:after="80"/>
+      </w:pPr>
+      <w:r>
+        <w:rPr>
+          <w:b w:val="0"/>
+          <w:sz w:val="22"/>
+        </w:rPr>
+        <w:t>· HEIIU EXPERIENCE CLASS sin costo: una clase Heiiu REAL de 45 min para grado 11 (en el colegio o en la sede) — se vive, no se presenta. Nunca un stand en feria.</w:t>
+      </w:r>
+    </w:p>
+    <w:p>
+      <w:pPr>
+        <w:spacing w:after="80"/>
+      </w:pPr>
+      <w:r>
+        <w:rPr>
+          <w:b w:val="0"/>
+          <w:sz w:val="22"/>
+        </w:rPr>
+        <w:t>· PREMIO HEIIU: beca anual al estudiante más destacado en inglés, entregada EN la ceremonia de grado del colegio — Heiiu presente en el escenario frente a los padres de familia. [Definir nivel de la beca: sugerido techo Transformación sobre el Arranque.]</w:t>
+      </w:r>
+    </w:p>
+    <w:p>
+      <w:pPr>
+        <w:spacing w:after="80"/>
+      </w:pPr>
+      <w:r>
+        <w:rPr>
+          <w:b w:val="0"/>
+          <w:sz w:val="22"/>
+        </w:rPr>
+        <w:t>· Charla para padres de grado 11 (escuela de padres): "el semestre que no se pierde" — el gap entre el grado y la universidad convertido en A1+A2 completos con garantía escrita y Módulo de Graduación.</w:t>
+      </w:r>
+    </w:p>
+    <w:p>
+      <w:pPr>
+        <w:spacing w:after="80"/>
+      </w:pPr>
+      <w:r>
+        <w:rPr>
+          <w:b w:val="0"/>
+          <w:sz w:val="22"/>
+        </w:rPr>
+        <w:t>· Convenio egresados: los graduados del colegio aliado reciben el beneficio de convenio (cuotas al porcentaje de contado) + prioridad de cupo en la cohorte de enero.</w:t>
+      </w:r>
+    </w:p>
+    <w:p>
+      <w:pPr>
+        <w:spacing w:after="80"/>
+      </w:pPr>
+      <w:r>
+        <w:rPr>
+          <w:b/>
+          <w:sz w:val="22"/>
+        </w:rPr>
+        <w:t>· TIMING: este canal construye la cohorte de ENERO (grado 11 se gradúa en noviembre) — se siembra en septiembre-octubre. Piloto: 2-3 colegios con relación previa, nunca en frío los primeros.</w:t>
+      </w:r>
+    </w:p>
+    <w:p>
+      <w:pPr>
+        <w:spacing w:before="160" w:after="80"/>
+      </w:pPr>
+      <w:r>
+        <w:rPr>
+          <w:b/>
+          <w:color w:val="E54C09"/>
+          <w:sz w:val="27"/>
+        </w:rPr>
         <w:t>3. CANDADOS OPERATIVOS (internos — no se muestran a la empresa)</w:t>
       </w:r>
     </w:p>
@@ -196,7 +269,7 @@
           <w:b/>
           <w:sz w:val="22"/>
         </w:rPr>
-        <w:t>· Las cartas salen firmadas por el rol Corporate Partnerships Officer únicamente cuando su contrato (con cláusula de propiedad intelectual) esté FIRMADO.</w:t>
+        <w:t>· Las cartas y los convenios los firma GERENCIA. El gestor de alianzas abre puertas y presenta — y solo actúa en ese rol cuando su contrato (con cláusula de propiedad intelectual y cesión) esté FIRMADO.</w:t>
       </w:r>
     </w:p>
     <w:p>

</xml_diff>